<commit_message>
Heartbeat Backup: 2026-05-06 00:23 UTC
</commit_message>
<xml_diff>
--- a/report_Benowa_ELC_2026-05-05.docx
+++ b/report_Benowa_ELC_2026-05-05.docx
@@ -36,7 +36,7 @@
         <w:pStyle w:val="ListBullet"/>
       </w:pPr>
       <w:r>
-        <w:t>1 active devices currently recorded in use.</w:t>
+        <w:t>3 active devices currently recorded in use.</w:t>
       </w:r>
     </w:p>
     <w:p>
@@ -156,6 +156,180 @@
       </w:r>
       <w:r>
         <w:t xml:space="preserve"> this is a test record</w:t>
+      </w:r>
+    </w:p>
+    <w:p>
+      <w:pPr>
+        <w:pStyle w:val="Heading2"/>
+      </w:pPr>
+      <w:r>
+        <w:rPr>
+          <w:color w:val="D32F2F"/>
+          <w:sz w:val="24"/>
+        </w:rPr>
+        <w:t>Melissa</w:t>
+      </w:r>
+    </w:p>
+    <w:p>
+      <w:pPr>
+        <w:pStyle w:val="ListBullet"/>
+      </w:pPr>
+      <w:r/>
+      <w:r>
+        <w:rPr>
+          <w:b/>
+        </w:rPr>
+        <w:t>Device:</w:t>
+      </w:r>
+      <w:r>
+        <w:t xml:space="preserve"> HP 15s-eq2xxx (SN: 5CD2170QH1Y)</w:t>
+      </w:r>
+    </w:p>
+    <w:p>
+      <w:pPr>
+        <w:pStyle w:val="ListBullet"/>
+      </w:pPr>
+      <w:r/>
+      <w:r>
+        <w:rPr>
+          <w:b/>
+        </w:rPr>
+        <w:t>OS:</w:t>
+      </w:r>
+      <w:r>
+        <w:t xml:space="preserve"> Windows N/A</w:t>
+      </w:r>
+    </w:p>
+    <w:p>
+      <w:pPr>
+        <w:pStyle w:val="ListBullet"/>
+      </w:pPr>
+      <w:r/>
+      <w:r>
+        <w:rPr>
+          <w:b/>
+        </w:rPr>
+        <w:t>Updates:</w:t>
+      </w:r>
+      <w:r>
+        <w:t xml:space="preserve"> N/A</w:t>
+      </w:r>
+    </w:p>
+    <w:p>
+      <w:pPr>
+        <w:pStyle w:val="ListBullet"/>
+      </w:pPr>
+      <w:r/>
+      <w:r>
+        <w:rPr>
+          <w:b/>
+        </w:rPr>
+        <w:t>Compliance:</w:t>
+      </w:r>
+      <w:r>
+        <w:t xml:space="preserve"> OneDrive Status: N/A | Security Check: N/A</w:t>
+      </w:r>
+    </w:p>
+    <w:p>
+      <w:pPr>
+        <w:pStyle w:val="ListBullet"/>
+      </w:pPr>
+      <w:r/>
+      <w:r>
+        <w:rPr>
+          <w:b/>
+        </w:rPr>
+        <w:t>Status/Notes:</w:t>
+      </w:r>
+      <w:r>
+        <w:t xml:space="preserve"> another site test of upload</w:t>
+      </w:r>
+    </w:p>
+    <w:p>
+      <w:pPr>
+        <w:pStyle w:val="Heading2"/>
+      </w:pPr>
+      <w:r>
+        <w:rPr>
+          <w:color w:val="D32F2F"/>
+          <w:sz w:val="24"/>
+        </w:rPr>
+        <w:t>Melissa</w:t>
+      </w:r>
+    </w:p>
+    <w:p>
+      <w:pPr>
+        <w:pStyle w:val="ListBullet"/>
+      </w:pPr>
+      <w:r/>
+      <w:r>
+        <w:rPr>
+          <w:b/>
+        </w:rPr>
+        <w:t>Device:</w:t>
+      </w:r>
+      <w:r>
+        <w:t xml:space="preserve"> HP 15s-eq2xxx (SN: 5CD2170QH1Y)</w:t>
+      </w:r>
+    </w:p>
+    <w:p>
+      <w:pPr>
+        <w:pStyle w:val="ListBullet"/>
+      </w:pPr>
+      <w:r/>
+      <w:r>
+        <w:rPr>
+          <w:b/>
+        </w:rPr>
+        <w:t>OS:</w:t>
+      </w:r>
+      <w:r>
+        <w:t xml:space="preserve"> Windows N/A</w:t>
+      </w:r>
+    </w:p>
+    <w:p>
+      <w:pPr>
+        <w:pStyle w:val="ListBullet"/>
+      </w:pPr>
+      <w:r/>
+      <w:r>
+        <w:rPr>
+          <w:b/>
+        </w:rPr>
+        <w:t>Updates:</w:t>
+      </w:r>
+      <w:r>
+        <w:t xml:space="preserve"> N/A</w:t>
+      </w:r>
+    </w:p>
+    <w:p>
+      <w:pPr>
+        <w:pStyle w:val="ListBullet"/>
+      </w:pPr>
+      <w:r/>
+      <w:r>
+        <w:rPr>
+          <w:b/>
+        </w:rPr>
+        <w:t>Compliance:</w:t>
+      </w:r>
+      <w:r>
+        <w:t xml:space="preserve"> OneDrive Status: N/A | Security Check: N/A</w:t>
+      </w:r>
+    </w:p>
+    <w:p>
+      <w:pPr>
+        <w:pStyle w:val="ListBullet"/>
+      </w:pPr>
+      <w:r/>
+      <w:r>
+        <w:rPr>
+          <w:b/>
+        </w:rPr>
+        <w:t>Status/Notes:</w:t>
+      </w:r>
+      <w:r>
+        <w:t xml:space="preserve"> another test</w:t>
       </w:r>
     </w:p>
     <w:p/>

</xml_diff>